<commit_message>
docs: corpus backup is the first action of the next session
Carried forward deliberately with the method (gzip + Dropbox and/or a
GitHub Release tagged to its commit, record the sha256) and why not into
git history. Both formats regenerated in sync.

Co-Authored-By: Claude Opus 5 <noreply@anthropic.com>
Claude-Session: https://claude.ai/code/session_012ewJNk8nij7ih4a7eirMZ9
</commit_message>
<xml_diff>
--- a/docs/handoffs/2026-09-01-allocator-state-of-play.docx
+++ b/docs/handoffs/2026-09-01-allocator-state-of-play.docx
@@ -1786,7 +1786,7 @@
           <w:sz w:val="21"/>
           <w:szCs w:val="21"/>
         </w:rPr>
-        <w:t xml:space="preserve">Get the corpus dump off the laptop.</w:t>
+        <w:t xml:space="preserve">Get the corpus dump off the laptop. → CARRIED FORWARD AS THE FIRST ACTION OF THE NEXT SESSION (see §9).</w:t>
       </w:r>
       <w:r>
         <w:rPr>
@@ -1811,6 +1811,219 @@
           <w:szCs w:val="21"/>
         </w:rPr>
         <w:t xml:space="preserve"> (41 MB) sits outside Dropbox, so it exists on one machine. It is the single irreplaceable artifact in this project — the model that produced those evaluations is retired, so it cannot be regenerated at any price. If it is lost, $141,837 joins $287k as a number nobody can reproduce.</w:t>
+      </w:r>
+    </w:p>
+    <w:p>
+      <w:pPr>
+        <w:spacing w:after="120" w:before="0" w:line="276"/>
+      </w:pPr>
+      <w:r>
+        <w:rPr>
+          <w:rFonts w:ascii="Calibri" w:cs="Calibri" w:eastAsia="Calibri" w:hAnsi="Calibri"/>
+          <w:b/>
+          <w:bCs/>
+          <w:sz w:val="21"/>
+          <w:szCs w:val="21"/>
+        </w:rPr>
+        <w:t xml:space="preserve">Not into git.</w:t>
+      </w:r>
+      <w:r>
+        <w:rPr>
+          <w:rFonts w:ascii="Calibri" w:cs="Calibri" w:eastAsia="Calibri" w:hAnsi="Calibri"/>
+          <w:sz w:val="21"/>
+          <w:szCs w:val="21"/>
+        </w:rPr>
+        <w:t xml:space="preserve"> A 41 MB blob that changes wholesale cannot be delta-compressed, so every future snapshot adds ~41 MB to the repository permanently; GitHub warns above 50 MB and fails at 100 MB. §10b also puts the corpus outside the repo by design — the corpus is data, the repo is code, and mixing them is what made </w:t>
+      </w:r>
+      <w:r>
+        <w:rPr>
+          <w:rFonts w:ascii="Consolas" w:cs="Consolas" w:eastAsia="Consolas" w:hAnsi="Consolas"/>
+          <w:sz w:val="19"/>
+          <w:szCs w:val="19"/>
+        </w:rPr>
+        <w:t xml:space="preserve">price_cache.json</w:t>
+      </w:r>
+      <w:r>
+        <w:rPr>
+          <w:rFonts w:ascii="Calibri" w:cs="Calibri" w:eastAsia="Calibri" w:hAnsi="Calibri"/>
+          <w:sz w:val="21"/>
+          <w:szCs w:val="21"/>
+        </w:rPr>
+        <w:t xml:space="preserve"> a hazard. The dump holds no account or position data (</w:t>
+      </w:r>
+      <w:r>
+        <w:rPr>
+          <w:rFonts w:ascii="Consolas" w:cs="Consolas" w:eastAsia="Consolas" w:hAnsi="Consolas"/>
+          <w:sz w:val="19"/>
+          <w:szCs w:val="19"/>
+        </w:rPr>
+        <w:t xml:space="preserve">Analysis</w:t>
+      </w:r>
+      <w:r>
+        <w:rPr>
+          <w:rFonts w:ascii="Calibri" w:cs="Calibri" w:eastAsia="Calibri" w:hAnsi="Calibri"/>
+          <w:sz w:val="21"/>
+          <w:szCs w:val="21"/>
+        </w:rPr>
+        <w:t xml:space="preserve"> / </w:t>
+      </w:r>
+      <w:r>
+        <w:rPr>
+          <w:rFonts w:ascii="Consolas" w:cs="Consolas" w:eastAsia="Consolas" w:hAnsi="Consolas"/>
+          <w:sz w:val="19"/>
+          <w:szCs w:val="19"/>
+        </w:rPr>
+        <w:t xml:space="preserve">Transcript</w:t>
+      </w:r>
+      <w:r>
+        <w:rPr>
+          <w:rFonts w:ascii="Calibri" w:cs="Calibri" w:eastAsia="Calibri" w:hAnsi="Calibri"/>
+          <w:sz w:val="21"/>
+          <w:szCs w:val="21"/>
+        </w:rPr>
+        <w:t xml:space="preserve"> / </w:t>
+      </w:r>
+      <w:r>
+        <w:rPr>
+          <w:rFonts w:ascii="Consolas" w:cs="Consolas" w:eastAsia="Consolas" w:hAnsi="Consolas"/>
+          <w:sz w:val="19"/>
+          <w:szCs w:val="19"/>
+        </w:rPr>
+        <w:t xml:space="preserve">Ticker</w:t>
+      </w:r>
+      <w:r>
+        <w:rPr>
+          <w:rFonts w:ascii="Calibri" w:cs="Calibri" w:eastAsia="Calibri" w:hAnsi="Calibri"/>
+          <w:sz w:val="21"/>
+          <w:szCs w:val="21"/>
+        </w:rPr>
+        <w:t xml:space="preserve"> only), but </w:t>
+      </w:r>
+      <w:r>
+        <w:rPr>
+          <w:rFonts w:ascii="Consolas" w:cs="Consolas" w:eastAsia="Consolas" w:hAnsi="Consolas"/>
+          <w:sz w:val="19"/>
+          <w:szCs w:val="19"/>
+        </w:rPr>
+        <w:t xml:space="preserve">Transcript.rawText</w:t>
+      </w:r>
+      <w:r>
+        <w:rPr>
+          <w:rFonts w:ascii="Calibri" w:cs="Calibri" w:eastAsia="Calibri" w:hAnsi="Calibri"/>
+          <w:sz w:val="21"/>
+          <w:szCs w:val="21"/>
+        </w:rPr>
+        <w:t xml:space="preserve"> is third-party earnings-call text, so confirm the repo’s visibility before it goes anywhere near GitHub.</w:t>
+      </w:r>
+    </w:p>
+    <w:p>
+      <w:pPr>
+        <w:spacing w:after="80" w:before="0" w:line="276"/>
+      </w:pPr>
+      <w:r>
+        <w:rPr>
+          <w:rFonts w:ascii="Calibri" w:cs="Calibri" w:eastAsia="Calibri" w:hAnsi="Calibri"/>
+          <w:b/>
+          <w:bCs/>
+          <w:sz w:val="21"/>
+          <w:szCs w:val="21"/>
+        </w:rPr>
+        <w:t xml:space="preserve">Do this instead:</w:t>
+      </w:r>
+      <w:r>
+        <w:rPr>
+          <w:rFonts w:ascii="Calibri" w:cs="Calibri" w:eastAsia="Calibri" w:hAnsi="Calibri"/>
+          <w:sz w:val="21"/>
+          <w:szCs w:val="21"/>
+        </w:rPr>
+        <w:t xml:space="preserve"> gzip it (SQL dumps compress roughly 10:1, so ~4–5 MB) and put it in Dropbox — instantly offsite, versioned, no new infrastructure. Better still, also attach the gzip to a </w:t>
+      </w:r>
+      <w:r>
+        <w:rPr>
+          <w:rFonts w:ascii="Calibri" w:cs="Calibri" w:eastAsia="Calibri" w:hAnsi="Calibri"/>
+          <w:b/>
+          <w:bCs/>
+          <w:sz w:val="21"/>
+          <w:szCs w:val="21"/>
+        </w:rPr>
+        <w:t xml:space="preserve">GitHub Release</w:t>
+      </w:r>
+      <w:r>
+        <w:rPr>
+          <w:rFonts w:ascii="Calibri" w:cs="Calibri" w:eastAsia="Calibri" w:hAnsi="Calibri"/>
+          <w:sz w:val="21"/>
+          <w:szCs w:val="21"/>
+        </w:rPr>
+        <w:t xml:space="preserve"> tagged to the commit it belongs with: release assets live outside git history, so no repository bloat, and it is versioned against a SHA, which is exactly what §10b’s manifest contract wants.</w:t>
+      </w:r>
+    </w:p>
+    <w:p>
+      <w:pPr>
+        <w:shd w:fill="F2F4F6" w:val="clear"/>
+        <w:spacing w:after="0" w:before="80" w:line="240"/>
+        <w:ind w:left="200"/>
+      </w:pPr>
+      <w:r>
+        <w:rPr>
+          <w:rFonts w:ascii="Consolas" w:cs="Consolas" w:eastAsia="Consolas" w:hAnsi="Consolas"/>
+          <w:sz w:val="18"/>
+          <w:szCs w:val="18"/>
+        </w:rPr>
+        <w:t xml:space="preserve">gzip -k ~/investment-agent-backups/analysis_corpus_20260830.sql</w:t>
+      </w:r>
+    </w:p>
+    <w:p>
+      <w:pPr>
+        <w:shd w:fill="F2F4F6" w:val="clear"/>
+        <w:spacing w:after="160" w:before="0" w:line="240"/>
+        <w:ind w:left="200"/>
+      </w:pPr>
+      <w:r>
+        <w:rPr>
+          <w:rFonts w:ascii="Consolas" w:cs="Consolas" w:eastAsia="Consolas" w:hAnsi="Consolas"/>
+          <w:sz w:val="18"/>
+          <w:szCs w:val="18"/>
+        </w:rPr>
+        <w:t xml:space="preserve">shasum -a 256 ~/investment-agent-backups/analysis_corpus_20260830.sql.gz</w:t>
+      </w:r>
+    </w:p>
+    <w:p>
+      <w:pPr>
+        <w:spacing w:after="120" w:before="0" w:line="276"/>
+      </w:pPr>
+      <w:r>
+        <w:rPr>
+          <w:rFonts w:ascii="Calibri" w:cs="Calibri" w:eastAsia="Calibri" w:hAnsi="Calibri"/>
+          <w:b/>
+          <w:bCs/>
+          <w:sz w:val="21"/>
+          <w:szCs w:val="21"/>
+        </w:rPr>
+        <w:t xml:space="preserve">Record that checksum.</w:t>
+      </w:r>
+      <w:r>
+        <w:rPr>
+          <w:rFonts w:ascii="Calibri" w:cs="Calibri" w:eastAsia="Calibri" w:hAnsi="Calibri"/>
+          <w:sz w:val="21"/>
+          <w:szCs w:val="21"/>
+        </w:rPr>
+        <w:t xml:space="preserve"> Every manifest references </w:t>
+      </w:r>
+      <w:r>
+        <w:rPr>
+          <w:rFonts w:ascii="Consolas" w:cs="Consolas" w:eastAsia="Consolas" w:hAnsi="Consolas"/>
+          <w:sz w:val="19"/>
+          <w:szCs w:val="19"/>
+        </w:rPr>
+        <w:t xml:space="preserve">corpus.db_snapshot_sha256</w:t>
+      </w:r>
+      <w:r>
+        <w:rPr>
+          <w:rFonts w:ascii="Calibri" w:cs="Calibri" w:eastAsia="Calibri" w:hAnsi="Calibri"/>
+          <w:sz w:val="21"/>
+          <w:szCs w:val="21"/>
+        </w:rPr>
+        <w:t xml:space="preserve"> and currently points at a file only one machine has.</w:t>
       </w:r>
     </w:p>
     <w:p>
@@ -2173,10 +2386,59 @@
       <w:r>
         <w:rPr>
           <w:rFonts w:ascii="Calibri" w:cs="Calibri" w:eastAsia="Calibri" w:hAnsi="Calibri"/>
-          <w:sz w:val="21"/>
-          <w:szCs w:val="21"/>
-        </w:rPr>
-        <w:t xml:space="preserve">Run the cadence prompt. Everything else waits on what K does to the limit value.</w:t>
+          <w:b/>
+          <w:bCs/>
+          <w:sz w:val="21"/>
+          <w:szCs w:val="21"/>
+        </w:rPr>
+        <w:t xml:space="preserve">1. Back up the corpus dump before anything else.</w:t>
+      </w:r>
+      <w:r>
+        <w:rPr>
+          <w:rFonts w:ascii="Calibri" w:cs="Calibri" w:eastAsia="Calibri" w:hAnsi="Calibri"/>
+          <w:sz w:val="21"/>
+          <w:szCs w:val="21"/>
+        </w:rPr>
+        <w:t xml:space="preserve"> Deferred from this session and carried forward deliberately: gzip </w:t>
+      </w:r>
+      <w:r>
+        <w:rPr>
+          <w:rFonts w:ascii="Consolas" w:cs="Consolas" w:eastAsia="Consolas" w:hAnsi="Consolas"/>
+          <w:sz w:val="19"/>
+          <w:szCs w:val="19"/>
+        </w:rPr>
+        <w:t xml:space="preserve">~/investment-agent-backups/analysis_corpus_20260830.sql</w:t>
+      </w:r>
+      <w:r>
+        <w:rPr>
+          <w:rFonts w:ascii="Calibri" w:cs="Calibri" w:eastAsia="Calibri" w:hAnsi="Calibri"/>
+          <w:sz w:val="21"/>
+          <w:szCs w:val="21"/>
+        </w:rPr>
+        <w:t xml:space="preserve">, put it in Dropbox and/or a GitHub Release tagged to its commit, and record the sha256 — see §7 for the commands and why not into git. This is five minutes of work protecting the one artifact in the project that cannot be regenerated at any price. Do it first, because it is the only item here whose cost of being skipped is unbounded.</w:t>
+      </w:r>
+    </w:p>
+    <w:p>
+      <w:pPr>
+        <w:spacing w:after="120" w:before="0" w:line="276"/>
+      </w:pPr>
+      <w:r>
+        <w:rPr>
+          <w:rFonts w:ascii="Calibri" w:cs="Calibri" w:eastAsia="Calibri" w:hAnsi="Calibri"/>
+          <w:b/>
+          <w:bCs/>
+          <w:sz w:val="21"/>
+          <w:szCs w:val="21"/>
+        </w:rPr>
+        <w:t xml:space="preserve">2. Then run the cadence prompt.</w:t>
+      </w:r>
+      <w:r>
+        <w:rPr>
+          <w:rFonts w:ascii="Calibri" w:cs="Calibri" w:eastAsia="Calibri" w:hAnsi="Calibri"/>
+          <w:sz w:val="21"/>
+          <w:szCs w:val="21"/>
+        </w:rPr>
+        <w:t xml:space="preserve"> Everything else waits on what K does to the limit value.</w:t>
       </w:r>
     </w:p>
     <w:p>

</xml_diff>